<commit_message>
Keep ID/phone/passport rows aligned: widen template columns, reject values that cannot fit
Co-Authored-By: Claude Sonnet 5 <noreply@anthropic.com>
</commit_message>
<xml_diff>
--- a/templates/guarantor-contract.docx
+++ b/templates/guarantor-contract.docx
@@ -954,11 +954,11 @@
               <w:gridCol w:w="1375"/>
               <w:gridCol w:w="1550"/>
               <w:gridCol w:w="664"/>
-              <w:gridCol w:w="1037"/>
+              <w:gridCol w:w="2100"/>
               <w:gridCol w:w="1156"/>
-              <w:gridCol w:w="1507"/>
-              <w:gridCol w:w="1434"/>
-              <w:gridCol w:w="1421"/>
+              <w:gridCol w:w="1800"/>
+              <w:gridCol w:w="750"/>
+              <w:gridCol w:w="749"/>
             </w:tblGrid>
             <w:tr>
               <w:tc>
@@ -1041,6 +1041,7 @@
               <w:tc>
                 <w:tcPr>
                   <w:tcW w:w="1550" w:type="dxa"/>
+                  <w:noWrap/>
                 </w:tcPr>
                 <w:p>
                   <w:pPr>
@@ -1118,7 +1119,8 @@
               </w:tc>
               <w:tc>
                 <w:tcPr>
-                  <w:tcW w:w="1037" w:type="dxa"/>
+                  <w:tcW w:w="2100" w:type="dxa"/>
+                  <w:noWrap/>
                 </w:tcPr>
                 <w:p>
                   <w:pPr>
@@ -1196,7 +1198,8 @@
               </w:tc>
               <w:tc>
                 <w:tcPr>
-                  <w:tcW w:w="1507" w:type="dxa"/>
+                  <w:tcW w:w="1800" w:type="dxa"/>
+                  <w:noWrap/>
                 </w:tcPr>
                 <w:p>
                   <w:pPr>
@@ -1231,7 +1234,7 @@
               </w:tc>
               <w:tc>
                 <w:tcPr>
-                  <w:tcW w:w="1434" w:type="dxa"/>
+                  <w:tcW w:w="750" w:type="dxa"/>
                   <w:vAlign w:val="center"/>
                 </w:tcPr>
                 <w:p>
@@ -1253,7 +1256,7 @@
               </w:tc>
               <w:tc>
                 <w:tcPr>
-                  <w:tcW w:w="1421" w:type="dxa"/>
+                  <w:tcW w:w="749" w:type="dxa"/>
                 </w:tcPr>
                 <w:p>
                   <w:pPr>
@@ -1589,11 +1592,11 @@
               <w:gridCol w:w="1375"/>
               <w:gridCol w:w="1550"/>
               <w:gridCol w:w="664"/>
-              <w:gridCol w:w="1046"/>
+              <w:gridCol w:w="2100"/>
               <w:gridCol w:w="1156"/>
-              <w:gridCol w:w="1507"/>
-              <w:gridCol w:w="1434"/>
-              <w:gridCol w:w="1421"/>
+              <w:gridCol w:w="1800"/>
+              <w:gridCol w:w="750"/>
+              <w:gridCol w:w="749"/>
             </w:tblGrid>
             <w:tr>
               <w:tc>
@@ -1676,6 +1679,7 @@
               <w:tc>
                 <w:tcPr>
                   <w:tcW w:w="1550" w:type="dxa"/>
+                  <w:noWrap/>
                 </w:tcPr>
                 <w:p>
                   <w:pPr>
@@ -1749,7 +1753,8 @@
               </w:tc>
               <w:tc>
                 <w:tcPr>
-                  <w:tcW w:w="1046" w:type="dxa"/>
+                  <w:tcW w:w="2100" w:type="dxa"/>
+                  <w:noWrap/>
                 </w:tcPr>
                 <w:p>
                   <w:pPr>
@@ -1827,7 +1832,8 @@
               </w:tc>
               <w:tc>
                 <w:tcPr>
-                  <w:tcW w:w="1507" w:type="dxa"/>
+                  <w:tcW w:w="1800" w:type="dxa"/>
+                  <w:noWrap/>
                 </w:tcPr>
                 <w:p>
                   <w:pPr>
@@ -1862,7 +1868,7 @@
               </w:tc>
               <w:tc>
                 <w:tcPr>
-                  <w:tcW w:w="1434" w:type="dxa"/>
+                  <w:tcW w:w="750" w:type="dxa"/>
                   <w:vAlign w:val="center"/>
                 </w:tcPr>
                 <w:p>
@@ -1884,7 +1890,7 @@
               </w:tc>
               <w:tc>
                 <w:tcPr>
-                  <w:tcW w:w="1421" w:type="dxa"/>
+                  <w:tcW w:w="749" w:type="dxa"/>
                 </w:tcPr>
                 <w:p>
                   <w:pPr>

</xml_diff>